<commit_message>
fix(tfl): align T-AE-02 SOC variable with metadata, correct source footnote
Two non-numeric corrections to T-AE-02:

1. AESOC -> AEBODSYS, matching the analysis variable declared in
   define/arm.xml (IT.ADAE.AEBODSYS), programming-specs/ADAE-spec.md
   and sap/shells/shells.yaml. Both variables exist in ADAE and are
   identical on every row, so the rendered table is unchanged —
   verified byte-identical in content after regeneration.

2. The source footnote read "WHERE TRTEMFL='Y'" but the program also
   filters SAFFL='Y' and takes its denominators from ADSL. Footnote
   now states both filters and the ADSL denominator source.

Note: T-AE-02.rtf is unchanged because save_as_rtf() writes the table
grid only — titles, population line and footnotes are omitted from
RTF by design (_helpers.R:382), on the assumption that regulatory
wrapping supplies them.

Co-Authored-By: Claude Opus 5 (1M context) <noreply@anthropic.com>
</commit_message>
<xml_diff>
--- a/tfl/tables/T-AE-02.docx
+++ b/tfl/tables/T-AE-02.docx
@@ -4394,7 +4394,7 @@
           <w:szCs w:val="16"/>
           <w:color w:val="000000"/>
         </w:rPr>
-        <w:t xml:space="preserve">Source: datasets/adam/adae.parquet WHERE TRTEMFL='Y'.</w:t>
+        <w:t xml:space="preserve">Source: datasets/adam/adae.parquet WHERE SAFFL='Y' AND TRTEMFL='Y'; datasets/adam/adsl.parquet WHERE SAFFL='Y' (denominators).</w:t>
       </w:r>
     </w:p>
     <w:p>
@@ -4420,7 +4420,7 @@
           <w:szCs w:val="14"/>
           <w:color w:val="C0392B"/>
         </w:rPr>
-        <w:t xml:space="preserve">DRAFT — produced 2026-07-19 — synthetic data, NOT for regulatory submission</w:t>
+        <w:t xml:space="preserve">DRAFT — produced 2026-09-20 — synthetic data, NOT for regulatory submission</w:t>
       </w:r>
     </w:p>
     <w:sectPr>

</xml_diff>